<commit_message>
fix(windows): el instalador ya no se detiene en cuentas con permisos de administrador
En PC personales la cuenta suele ser administradora (o con UAC desactivado) y el chequeo bloqueaba
la instalación en el paso 0. initdb/pg_ctl reducen sus propios permisos, así que ahora solo se avisa.
También se endurece Pg-Corriendo para PowerShell 5.1 y se actualiza el manual.

Co-Authored-By: Claude Sonnet 5.5 <noreply@anthropic.com>
Claude-Session: https://claude.ai/code/session_013PoMAaFMkJXtxRVwVRYUNM
</commit_message>
<xml_diff>
--- a/sabsmuni-anpe/docs/Manual_Implementacion_SABSMUNI-ANPE.docx
+++ b/sabsmuni-anpe/docs/Manual_Implementacion_SABSMUNI-ANPE.docx
@@ -2122,7 +2122,7 @@
               <w:rPr>
                 <w:rFonts w:ascii="Calibri" w:cs="Calibri" w:eastAsia="Calibri" w:hAnsi="Calibri"/>
               </w:rPr>
-              <w:t xml:space="preserve">Cuenta de usuario normal</w:t>
+              <w:t xml:space="preserve">Cuenta de usuario de Windows</w:t>
             </w:r>
           </w:p>
         </w:tc>
@@ -2151,16 +2151,8 @@
             <w:r>
               <w:rPr>
                 <w:rFonts w:ascii="Calibri" w:cs="Calibri" w:eastAsia="Calibri" w:hAnsi="Calibri"/>
-                <w:b/>
-                <w:bCs/>
-              </w:rPr>
-              <w:t xml:space="preserve">No</w:t>
-            </w:r>
-            <w:r>
-              <w:rPr>
-                <w:rFonts w:ascii="Calibri" w:cs="Calibri" w:eastAsia="Calibri" w:hAnsi="Calibri"/>
-              </w:rPr>
-              <w:t xml:space="preserve"> ejecute nada «como administrador»</w:t>
+              </w:rPr>
+              <w:t xml:space="preserve">Normal o administradora: ambas sirven. No hace falta «Ejecutar como administrador»</w:t>
             </w:r>
           </w:p>
         </w:tc>
@@ -2190,7 +2182,7 @@
               <w:rPr>
                 <w:rFonts w:ascii="Calibri" w:cs="Calibri" w:eastAsia="Calibri" w:hAnsi="Calibri"/>
               </w:rPr>
-              <w:t xml:space="preserve">Haga doble clic normal, sin clic derecho</w:t>
+              <w:t xml:space="preserve">Haga doble clic normal en los archivos .bat</w:t>
             </w:r>
           </w:p>
         </w:tc>
@@ -2261,13 +2253,13 @@
                 <w:b/>
                 <w:bCs/>
               </w:rPr>
-              <w:t xml:space="preserve">No use «Ejecutar como administrador».</w:t>
-            </w:r>
-            <w:r>
-              <w:rPr>
-                <w:rFonts w:ascii="Calibri" w:cs="Calibri" w:eastAsia="Calibri" w:hAnsi="Calibri"/>
-              </w:rPr>
-              <w:t xml:space="preserve"> PostgreSQL (la base de datos) se niega a funcionar con permisos de administrador y el instalador se detendrá con un mensaje claro.</w:t>
+              <w:t xml:space="preserve">Permisos de administrador:</w:t>
+            </w:r>
+            <w:r>
+              <w:rPr>
+                <w:rFonts w:ascii="Calibri" w:cs="Calibri" w:eastAsia="Calibri" w:hAnsi="Calibri"/>
+              </w:rPr>
+              <w:t xml:space="preserve"> no son necesarios; haga doble clic normal. Si su cuenta de Windows ya es administradora (lo habitual en computadoras personales), el instalador mostrará un aviso amarillo y continuará sin problema.</w:t>
             </w:r>
           </w:p>
           <w:p>
@@ -4005,7 +3997,7 @@
               <w:rPr>
                 <w:rFonts w:ascii="Calibri" w:cs="Calibri" w:eastAsia="Calibri" w:hAnsi="Calibri"/>
               </w:rPr>
-              <w:t xml:space="preserve">Comprueba la carpeta, el espacio en disco y que no sea administrador</w:t>
+              <w:t xml:space="preserve">Comprueba la carpeta y el espacio en disco</w:t>
             </w:r>
           </w:p>
         </w:tc>
@@ -14638,7 +14630,7 @@
               <w:rPr>
                 <w:rFonts w:ascii="Calibri" w:cs="Calibri" w:eastAsia="Calibri" w:hAnsi="Calibri"/>
               </w:rPr>
-              <w:t xml:space="preserve">«No ejecute este instalador como Administrador»</w:t>
+              <w:t xml:space="preserve">Aviso amarillo «Esta ventana tiene permisos de administrador»</w:t>
             </w:r>
           </w:p>
         </w:tc>
@@ -14668,7 +14660,7 @@
               <w:rPr>
                 <w:rFonts w:ascii="Calibri" w:cs="Calibri" w:eastAsia="Calibri" w:hAnsi="Calibri"/>
               </w:rPr>
-              <w:t xml:space="preserve">Se abrió con clic derecho → Ejecutar como administrador</w:t>
+              <w:t xml:space="preserve">Su cuenta de Windows es administradora</w:t>
             </w:r>
           </w:p>
         </w:tc>
@@ -14698,7 +14690,7 @@
               <w:rPr>
                 <w:rFonts w:ascii="Calibri" w:cs="Calibri" w:eastAsia="Calibri" w:hAnsi="Calibri"/>
               </w:rPr>
-              <w:t xml:space="preserve">Cierre y haga doble clic normal</w:t>
+              <w:t xml:space="preserve">Es solo un aviso: el instalador continúa solo</w:t>
             </w:r>
           </w:p>
         </w:tc>

</xml_diff>